<commit_message>
added a table in the raport
</commit_message>
<xml_diff>
--- a/Raport_Bogatu_Alexei_DAW241.docx
+++ b/Raport_Bogatu_Alexei_DAW241.docx
@@ -2597,6 +2597,8 @@
         <w:pStyle w:val="NormalWeb"/>
         <w:ind w:firstLine="0"/>
       </w:pPr>
+      <w:bookmarkStart w:id="18" w:name="_GoBack"/>
+      <w:bookmarkEnd w:id="18"/>
       <w:r>
         <w:rPr>
           <w:noProof/>
@@ -2816,8 +2818,6 @@
         <w:pStyle w:val="NormalWeb"/>
         <w:ind w:firstLine="0"/>
       </w:pPr>
-      <w:bookmarkStart w:id="18" w:name="_GoBack"/>
-      <w:bookmarkEnd w:id="18"/>
       <w:r>
         <w:rPr>
           <w:noProof/>
@@ -2874,6 +2874,405 @@
       <w:pPr>
         <w:pStyle w:val="NormalWeb"/>
       </w:pPr>
+      <w:r>
+        <w:t>Conform datelor din tabelul 1.1, se prezintă o analiză comparativă a platformelor studiate în raport cu funcționalitățile proiectului realizat.</w:t>
+      </w:r>
+    </w:p>
+    <w:p>
+      <w:pPr>
+        <w:pStyle w:val="NormalWeb"/>
+        <w:spacing w:before="120" w:after="60"/>
+        <w:jc w:val="right"/>
+      </w:pPr>
+      <w:r>
+        <w:rPr>
+          <w:b/>
+        </w:rPr>
+        <w:t>Tabelul 1.1 – Analiza comparativă a platformelor similare</w:t>
+      </w:r>
+    </w:p>
+    <w:tbl>
+      <w:tblPr>
+        <w:tblW w:w="10205" w:type="dxa"/>
+        <w:tblBorders>
+          <w:top w:val="single" w:sz="4" w:space="0" w:color="000000"/>
+          <w:left w:val="single" w:sz="4" w:space="0" w:color="000000"/>
+          <w:bottom w:val="single" w:sz="4" w:space="0" w:color="000000"/>
+          <w:right w:val="single" w:sz="4" w:space="0" w:color="000000"/>
+          <w:insideH w:val="single" w:sz="4" w:space="0" w:color="000000"/>
+          <w:insideV w:val="single" w:sz="4" w:space="0" w:color="000000"/>
+        </w:tblBorders>
+        <w:tblLook w:val="04A0" w:firstRow="1" w:lastRow="0" w:firstColumn="1" w:lastColumn="0" w:noHBand="0" w:noVBand="1"/>
+      </w:tblPr>
+      <w:tblGrid>
+        <w:gridCol w:w="1700"/>
+        <w:gridCol w:w="4252"/>
+        <w:gridCol w:w="4253"/>
+      </w:tblGrid>
+      <w:tr>
+        <w:trPr>
+          <w:tblHeader/>
+        </w:trPr>
+        <w:tc>
+          <w:tcPr>
+            <w:tcW w:w="1700" w:type="dxa"/>
+            <w:shd w:val="clear" w:color="auto" w:fill="2E74B5"/>
+            <w:tcMar>
+              <w:top w:w="80" w:type="dxa"/>
+              <w:left w:w="120" w:type="dxa"/>
+              <w:bottom w:w="80" w:type="dxa"/>
+              <w:right w:w="120" w:type="dxa"/>
+            </w:tcMar>
+          </w:tcPr>
+          <w:p>
+            <w:pPr>
+              <w:jc w:val="center"/>
+              <w:rPr>
+                <w:b/>
+                <w:color w:val="FFFFFF"/>
+                <w:sz w:val="22"/>
+              </w:rPr>
+            </w:pPr>
+            <w:r>
+              <w:rPr>
+                <w:b/>
+                <w:color w:val="FFFFFF"/>
+                <w:sz w:val="22"/>
+              </w:rPr>
+              <w:t>Platformă</w:t>
+            </w:r>
+          </w:p>
+        </w:tc>
+        <w:tc>
+          <w:tcPr>
+            <w:tcW w:w="4252" w:type="dxa"/>
+            <w:shd w:val="clear" w:color="auto" w:fill="2E74B5"/>
+            <w:tcMar>
+              <w:top w:w="80" w:type="dxa"/>
+              <w:left w:w="120" w:type="dxa"/>
+              <w:bottom w:w="80" w:type="dxa"/>
+              <w:right w:w="120" w:type="dxa"/>
+            </w:tcMar>
+          </w:tcPr>
+          <w:p>
+            <w:pPr>
+              <w:jc w:val="center"/>
+              <w:rPr>
+                <w:b/>
+                <w:color w:val="FFFFFF"/>
+                <w:sz w:val="22"/>
+              </w:rPr>
+            </w:pPr>
+            <w:r>
+              <w:rPr>
+                <w:b/>
+                <w:color w:val="FFFFFF"/>
+                <w:sz w:val="22"/>
+              </w:rPr>
+              <w:t>Avantaje față de proiect</w:t>
+            </w:r>
+          </w:p>
+        </w:tc>
+        <w:tc>
+          <w:tcPr>
+            <w:tcW w:w="4253" w:type="dxa"/>
+            <w:shd w:val="clear" w:color="auto" w:fill="2E74B5"/>
+            <w:tcMar>
+              <w:top w:w="80" w:type="dxa"/>
+              <w:left w:w="120" w:type="dxa"/>
+              <w:bottom w:w="80" w:type="dxa"/>
+              <w:right w:w="120" w:type="dxa"/>
+            </w:tcMar>
+          </w:tcPr>
+          <w:p>
+            <w:pPr>
+              <w:jc w:val="center"/>
+              <w:rPr>
+                <w:b/>
+                <w:color w:val="FFFFFF"/>
+                <w:sz w:val="22"/>
+              </w:rPr>
+            </w:pPr>
+            <w:r>
+              <w:rPr>
+                <w:b/>
+                <w:color w:val="FFFFFF"/>
+                <w:sz w:val="22"/>
+              </w:rPr>
+              <w:t>Dezavantaje față de proiect</w:t>
+            </w:r>
+          </w:p>
+        </w:tc>
+      </w:tr>
+      <w:tr>
+        <w:tc>
+          <w:tcPr>
+            <w:tcW w:w="1700" w:type="dxa"/>
+            <w:shd w:val="clear" w:color="auto" w:fill="D6E4F0"/>
+            <w:tcMar>
+              <w:top w:w="80" w:type="dxa"/>
+              <w:left w:w="120" w:type="dxa"/>
+              <w:bottom w:w="80" w:type="dxa"/>
+              <w:right w:w="120" w:type="dxa"/>
+            </w:tcMar>
+          </w:tcPr>
+          <w:p>
+            <w:pPr>
+              <w:jc w:val="center"/>
+              <w:rPr>
+                <w:b/>
+                <w:sz w:val="22"/>
+              </w:rPr>
+            </w:pPr>
+            <w:r>
+              <w:rPr>
+                <w:b/>
+                <w:sz w:val="22"/>
+              </w:rPr>
+              <w:t>Fest.md</w:t>
+            </w:r>
+          </w:p>
+        </w:tc>
+        <w:tc>
+          <w:tcPr>
+            <w:tcW w:w="4252" w:type="dxa"/>
+            <w:tcMar>
+              <w:top w:w="80" w:type="dxa"/>
+              <w:left w:w="120" w:type="dxa"/>
+              <w:bottom w:w="80" w:type="dxa"/>
+              <w:right w:w="120" w:type="dxa"/>
+            </w:tcMar>
+          </w:tcPr>
+          <w:p>
+            <w:pPr>
+              <w:rPr>
+                <w:sz w:val="22"/>
+              </w:rPr>
+            </w:pPr>
+            <w:r>
+              <w:rPr>
+                <w:sz w:val="22"/>
+              </w:rPr>
+              <w:t xml:space="preserve">Structură simplă și </w:t>
+            </w:r>
+            <w:r>
+              <w:rPr>
+                <w:sz w:val="22"/>
+              </w:rPr>
+              <w:t>accesibilă; organizare pe categorii; afișare clară a datei, orei și locației evenimentului; pagini dedicate cu descrieri și imagini.</w:t>
+            </w:r>
+          </w:p>
+        </w:tc>
+        <w:tc>
+          <w:tcPr>
+            <w:tcW w:w="4253" w:type="dxa"/>
+            <w:tcMar>
+              <w:top w:w="80" w:type="dxa"/>
+              <w:left w:w="120" w:type="dxa"/>
+              <w:bottom w:w="80" w:type="dxa"/>
+              <w:right w:w="120" w:type="dxa"/>
+            </w:tcMar>
+          </w:tcPr>
+          <w:p>
+            <w:pPr>
+              <w:rPr>
+                <w:sz w:val="22"/>
+              </w:rPr>
+            </w:pPr>
+            <w:r>
+              <w:rPr>
+                <w:sz w:val="22"/>
+              </w:rPr>
+              <w:t>Design învechit față de standardele actuale; lipsesc funcții interactive (autentificare, adăugare evenimente, dark mode, sc</w:t>
+            </w:r>
+            <w:r>
+              <w:rPr>
+                <w:sz w:val="22"/>
+              </w:rPr>
+              <w:t>himbare limbă); nu există sistem de filtrare avansat.</w:t>
+            </w:r>
+          </w:p>
+        </w:tc>
+      </w:tr>
+      <w:tr>
+        <w:tc>
+          <w:tcPr>
+            <w:tcW w:w="1700" w:type="dxa"/>
+            <w:shd w:val="clear" w:color="auto" w:fill="D6E4F0"/>
+            <w:tcMar>
+              <w:top w:w="80" w:type="dxa"/>
+              <w:left w:w="120" w:type="dxa"/>
+              <w:bottom w:w="80" w:type="dxa"/>
+              <w:right w:w="120" w:type="dxa"/>
+            </w:tcMar>
+          </w:tcPr>
+          <w:p>
+            <w:pPr>
+              <w:jc w:val="center"/>
+              <w:rPr>
+                <w:b/>
+                <w:sz w:val="22"/>
+              </w:rPr>
+            </w:pPr>
+            <w:r>
+              <w:rPr>
+                <w:b/>
+                <w:sz w:val="22"/>
+              </w:rPr>
+              <w:t>Afisha.md</w:t>
+            </w:r>
+          </w:p>
+        </w:tc>
+        <w:tc>
+          <w:tcPr>
+            <w:tcW w:w="4252" w:type="dxa"/>
+            <w:tcMar>
+              <w:top w:w="80" w:type="dxa"/>
+              <w:left w:w="120" w:type="dxa"/>
+              <w:bottom w:w="80" w:type="dxa"/>
+              <w:right w:w="120" w:type="dxa"/>
+            </w:tcMar>
+          </w:tcPr>
+          <w:p>
+            <w:pPr>
+              <w:rPr>
+                <w:sz w:val="22"/>
+              </w:rPr>
+            </w:pPr>
+            <w:r>
+              <w:rPr>
+                <w:sz w:val="22"/>
+              </w:rPr>
+              <w:t>Interfață modernă și bine organizată; filtrare după dată și categorie; sistem de achitare online pentru bilete; imagini și descrieri detaliate per eveniment.</w:t>
+            </w:r>
+          </w:p>
+        </w:tc>
+        <w:tc>
+          <w:tcPr>
+            <w:tcW w:w="4253" w:type="dxa"/>
+            <w:tcMar>
+              <w:top w:w="80" w:type="dxa"/>
+              <w:left w:w="120" w:type="dxa"/>
+              <w:bottom w:w="80" w:type="dxa"/>
+              <w:right w:w="120" w:type="dxa"/>
+            </w:tcMar>
+          </w:tcPr>
+          <w:p>
+            <w:pPr>
+              <w:rPr>
+                <w:sz w:val="22"/>
+              </w:rPr>
+            </w:pPr>
+            <w:r>
+              <w:rPr>
+                <w:sz w:val="22"/>
+              </w:rPr>
+              <w:t xml:space="preserve">Nu permite utilizatorilor să </w:t>
+            </w:r>
+            <w:r>
+              <w:rPr>
+                <w:sz w:val="22"/>
+              </w:rPr>
+              <w:t>adauge propriile evenimente; nu oferă dark mode sau schimbare de limbă; unele informații sunt disponibile doar pentru evenimentele populare; necesită conexiune bună la internet.</w:t>
+            </w:r>
+          </w:p>
+        </w:tc>
+      </w:tr>
+      <w:tr>
+        <w:tc>
+          <w:tcPr>
+            <w:tcW w:w="1700" w:type="dxa"/>
+            <w:shd w:val="clear" w:color="auto" w:fill="D6E4F0"/>
+            <w:tcMar>
+              <w:top w:w="80" w:type="dxa"/>
+              <w:left w:w="120" w:type="dxa"/>
+              <w:bottom w:w="80" w:type="dxa"/>
+              <w:right w:w="120" w:type="dxa"/>
+            </w:tcMar>
+          </w:tcPr>
+          <w:p>
+            <w:pPr>
+              <w:jc w:val="center"/>
+              <w:rPr>
+                <w:b/>
+                <w:sz w:val="22"/>
+              </w:rPr>
+            </w:pPr>
+            <w:r>
+              <w:rPr>
+                <w:b/>
+                <w:sz w:val="22"/>
+              </w:rPr>
+              <w:t>iTicket</w:t>
+            </w:r>
+          </w:p>
+        </w:tc>
+        <w:tc>
+          <w:tcPr>
+            <w:tcW w:w="4252" w:type="dxa"/>
+            <w:tcMar>
+              <w:top w:w="80" w:type="dxa"/>
+              <w:left w:w="120" w:type="dxa"/>
+              <w:bottom w:w="80" w:type="dxa"/>
+              <w:right w:w="120" w:type="dxa"/>
+            </w:tcMar>
+          </w:tcPr>
+          <w:p>
+            <w:pPr>
+              <w:rPr>
+                <w:sz w:val="22"/>
+              </w:rPr>
+            </w:pPr>
+            <w:r>
+              <w:rPr>
+                <w:sz w:val="22"/>
+              </w:rPr>
+              <w:t xml:space="preserve">Interfață modernă și bine structurată; cumpărare online a biletelor; </w:t>
+            </w:r>
+            <w:r>
+              <w:rPr>
+                <w:sz w:val="22"/>
+              </w:rPr>
+              <w:t>imagini reprezentative și rezervare locuri; adaptat pentru dispozitive mobile și desktop.</w:t>
+            </w:r>
+          </w:p>
+        </w:tc>
+        <w:tc>
+          <w:tcPr>
+            <w:tcW w:w="4253" w:type="dxa"/>
+            <w:tcMar>
+              <w:top w:w="80" w:type="dxa"/>
+              <w:left w:w="120" w:type="dxa"/>
+              <w:bottom w:w="80" w:type="dxa"/>
+              <w:right w:w="120" w:type="dxa"/>
+            </w:tcMar>
+          </w:tcPr>
+          <w:p>
+            <w:pPr>
+              <w:rPr>
+                <w:sz w:val="22"/>
+              </w:rPr>
+            </w:pPr>
+            <w:r>
+              <w:rPr>
+                <w:sz w:val="22"/>
+              </w:rPr>
+              <w:t>Axat predominant pe vânzarea biletelor, nu pe interacțiunea utilizator-organizator; evenimentele mici sunt promovate mai puțin vizibil; nu permite adăugarea de evenim</w:t>
+            </w:r>
+            <w:r>
+              <w:rPr>
+                <w:sz w:val="22"/>
+              </w:rPr>
+              <w:t>ente de către utilizatori simpli.</w:t>
+            </w:r>
+          </w:p>
+        </w:tc>
+      </w:tr>
+    </w:tbl>
+    <w:p>
+      <w:pPr>
+        <w:pStyle w:val="NormalWeb"/>
+      </w:pPr>
     </w:p>
     <w:p>
       <w:pPr>
@@ -2904,7 +3303,11 @@
         <w:pStyle w:val="NormalWeb"/>
       </w:pPr>
       <w:r>
-        <w:t>Scopul principal al aplicației este de a crea o platformă web modernă care să permită utilizatorilor să vizualizeze, să caute și să selecteze evenimentele la care doresc să participe. Sistemul va avea rolul de a facilita comunicarea dintre organizatori și participanți, oferind acces rapid la informații utile despre evenimentele disponibile.</w:t>
+        <w:t xml:space="preserve">Scopul principal al aplicației este de a crea o platformă web modernă care să permită utilizatorilor să vizualizeze, să caute și să selecteze evenimentele la care doresc să participe. Sistemul va avea rolul de a </w:t>
+      </w:r>
+      <w:r>
+        <w:lastRenderedPageBreak/>
+        <w:t>facilita comunicarea dintre organizatori și participanți, oferind acces rapid la informații utile despre evenimentele disponibile.</w:t>
       </w:r>
     </w:p>
     <w:p>
@@ -3074,7 +3477,6 @@
         <w:rPr>
           <w:lang w:val="en-US"/>
         </w:rPr>
-        <w:lastRenderedPageBreak/>
         <w:t>Pagin</w:t>
       </w:r>
       <w:r>
@@ -3866,7 +4268,7 @@
           <w:rPr>
             <w:noProof/>
           </w:rPr>
-          <w:t>11</w:t>
+          <w:t>20</w:t>
         </w:r>
         <w:r>
           <w:rPr>
@@ -8728,6 +9130,21 @@
 </file>
 
 <file path=customXml/item1.xml><?xml version="1.0" encoding="utf-8"?>
+<p:properties xmlns:p="http://schemas.microsoft.com/office/2006/metadata/properties" xmlns:xsi="http://www.w3.org/2001/XMLSchema-instance" xmlns:pc="http://schemas.microsoft.com/office/infopath/2007/PartnerControls">
+  <documentManagement/>
+</p:properties>
+</file>
+
+<file path=customXml/item2.xml><?xml version="1.0" encoding="utf-8"?>
+<?mso-contentType ?>
+<FormTemplates xmlns="http://schemas.microsoft.com/sharepoint/v3/contenttype/forms">
+  <Display>DocumentLibraryForm</Display>
+  <Edit>DocumentLibraryForm</Edit>
+  <New>DocumentLibraryForm</New>
+</FormTemplates>
+</file>
+
+<file path=customXml/item3.xml><?xml version="1.0" encoding="utf-8"?>
 <ct:contentTypeSchema xmlns:ct="http://schemas.microsoft.com/office/2006/metadata/contentType" xmlns:ma="http://schemas.microsoft.com/office/2006/metadata/properties/metaAttributes" ct:_="" ma:_="" ma:contentTypeName="Document" ma:contentTypeID="0x010100E2EA66BE5C81C343B7C33536B4C68808" ma:contentTypeVersion="0" ma:contentTypeDescription="Create a new document." ma:contentTypeScope="" ma:versionID="463f4ea012206328e95b1b10e221c028">
   <xsd:schema xmlns:xsd="http://www.w3.org/2001/XMLSchema" xmlns:xs="http://www.w3.org/2001/XMLSchema" xmlns:p="http://schemas.microsoft.com/office/2006/metadata/properties" targetNamespace="http://schemas.microsoft.com/office/2006/metadata/properties" ma:root="true" ma:fieldsID="0967b7be50301903c78f9c39c6fd9af8">
     <xsd:element name="properties">
@@ -8841,26 +9258,28 @@
 </ct:contentTypeSchema>
 </file>
 
-<file path=customXml/item2.xml><?xml version="1.0" encoding="utf-8"?>
-<p:properties xmlns:p="http://schemas.microsoft.com/office/2006/metadata/properties" xmlns:xsi="http://www.w3.org/2001/XMLSchema-instance" xmlns:pc="http://schemas.microsoft.com/office/infopath/2007/PartnerControls">
-  <documentManagement/>
-</p:properties>
-</file>
-
-<file path=customXml/item3.xml><?xml version="1.0" encoding="utf-8"?>
-<?mso-contentType ?>
-<FormTemplates xmlns="http://schemas.microsoft.com/sharepoint/v3/contenttype/forms">
-  <Display>DocumentLibraryForm</Display>
-  <Edit>DocumentLibraryForm</Edit>
-  <New>DocumentLibraryForm</New>
-</FormTemplates>
-</file>
-
 <file path=customXml/item4.xml><?xml version="1.0" encoding="utf-8"?>
 <b:Sources xmlns:b="http://schemas.openxmlformats.org/officeDocument/2006/bibliography" xmlns="http://schemas.openxmlformats.org/officeDocument/2006/bibliography" SelectedStyle="\APASixthEditionOfficeOnline.xsl" StyleName="APA" Version="6"/>
 </file>
 
 <file path=customXml/itemProps1.xml><?xml version="1.0" encoding="utf-8"?>
+<ds:datastoreItem xmlns:ds="http://schemas.openxmlformats.org/officeDocument/2006/customXml" ds:itemID="{241CD2DB-FA65-4BD6-A77E-85A027FA04CE}">
+  <ds:schemaRefs>
+    <ds:schemaRef ds:uri="http://schemas.microsoft.com/office/2006/metadata/properties"/>
+    <ds:schemaRef ds:uri="http://schemas.microsoft.com/office/infopath/2007/PartnerControls"/>
+  </ds:schemaRefs>
+</ds:datastoreItem>
+</file>
+
+<file path=customXml/itemProps2.xml><?xml version="1.0" encoding="utf-8"?>
+<ds:datastoreItem xmlns:ds="http://schemas.openxmlformats.org/officeDocument/2006/customXml" ds:itemID="{418D6107-FE63-48DF-8061-871D414E4120}">
+  <ds:schemaRefs>
+    <ds:schemaRef ds:uri="http://schemas.microsoft.com/sharepoint/v3/contenttype/forms"/>
+  </ds:schemaRefs>
+</ds:datastoreItem>
+</file>
+
+<file path=customXml/itemProps3.xml><?xml version="1.0" encoding="utf-8"?>
 <ds:datastoreItem xmlns:ds="http://schemas.openxmlformats.org/officeDocument/2006/customXml" ds:itemID="{87EC161E-AD17-4F01-8950-F6F0CB842FFE}">
   <ds:schemaRefs>
     <ds:schemaRef ds:uri="http://schemas.microsoft.com/office/2006/metadata/contentType"/>
@@ -8876,25 +9295,8 @@
 </ds:datastoreItem>
 </file>
 
-<file path=customXml/itemProps2.xml><?xml version="1.0" encoding="utf-8"?>
-<ds:datastoreItem xmlns:ds="http://schemas.openxmlformats.org/officeDocument/2006/customXml" ds:itemID="{241CD2DB-FA65-4BD6-A77E-85A027FA04CE}">
-  <ds:schemaRefs>
-    <ds:schemaRef ds:uri="http://schemas.microsoft.com/office/2006/metadata/properties"/>
-    <ds:schemaRef ds:uri="http://schemas.microsoft.com/office/infopath/2007/PartnerControls"/>
-  </ds:schemaRefs>
-</ds:datastoreItem>
-</file>
-
-<file path=customXml/itemProps3.xml><?xml version="1.0" encoding="utf-8"?>
-<ds:datastoreItem xmlns:ds="http://schemas.openxmlformats.org/officeDocument/2006/customXml" ds:itemID="{418D6107-FE63-48DF-8061-871D414E4120}">
-  <ds:schemaRefs>
-    <ds:schemaRef ds:uri="http://schemas.microsoft.com/sharepoint/v3/contenttype/forms"/>
-  </ds:schemaRefs>
-</ds:datastoreItem>
-</file>
-
 <file path=customXml/itemProps4.xml><?xml version="1.0" encoding="utf-8"?>
-<ds:datastoreItem xmlns:ds="http://schemas.openxmlformats.org/officeDocument/2006/customXml" ds:itemID="{E093814A-F7A3-4E37-8FBD-EF2B1D3AE64C}">
+<ds:datastoreItem xmlns:ds="http://schemas.openxmlformats.org/officeDocument/2006/customXml" ds:itemID="{5DDE848D-EEE9-4994-82D4-B4E5BF30A614}">
   <ds:schemaRefs>
     <ds:schemaRef ds:uri="http://schemas.openxmlformats.org/officeDocument/2006/bibliography"/>
   </ds:schemaRefs>

</xml_diff>